<commit_message>
added arabic practice in ecucation section and added more arabic words
</commit_message>
<xml_diff>
--- a/docs/Education_Page_Section.docx
+++ b/docs/Education_Page_Section.docx
@@ -7,7 +7,7 @@
         <w:pStyle w:val="Heading1"/>
       </w:pPr>
       <w:r>
-        <w:t>13. Education Page — ASL Stickman Visualizations</w:t>
+        <w:t>13. Education Section — Bilingual Sign-Language Learning</w:t>
       </w:r>
     </w:p>
     <w:p>
@@ -22,12 +22,12 @@
         <w:t xml:space="preserve">Purpose: </w:t>
       </w:r>
       <w:r>
-        <w:t>This section documents the Education tab of the application (the “stickman” pages) at the same technical depth as the Translation &amp; Chat features described earlier in this chapter: its two-panel layout, the shared Canvas2D rendering engine that drives both panels, the keyframe/inverse-kinematics animation system used for full-body word signs, the procedurally generated fingerspelling hand-pose library, and the performance and correctness engineering decisions specific to this feature.</w:t>
+        <w:t>This section documents the Education tab of the application at the same technical depth as the Translation &amp; Chat features described earlier in this chapter: its three learning tools (Sign Viewer, Sentence Builder, and Practice mode), the motion-capture skeleton rendering that replaced the earlier hand-drawn stickman, the server-side animation stitching pipeline, the bilingual ASL/ArSL architecture, and the content verification methodology that guarantees every sign the page teaches is a genuine sign performed by a real signer.</w:t>
       </w:r>
     </w:p>
     <w:p>
       <w:r>
-        <w:t>Unlike the Chatting tab, the Education tab performs no server round-trip: it is a fully client-side, dependency-light feature built entirely on the browser's native Canvas 2D API and plain JavaScript. Its purpose is instructional — helping a user learn to read ASL handshapes and word signs — rather than translating a live camera feed.</w:t>
+        <w:t>The Education tab turns the application from a translation tool into a learning platform: instead of only translating a deaf user's signing for a hearing conversation partner, it teaches the hearing user to sign back. It supports both of the application's languages — American Sign Language (ASL, paired with English) and Arabic Sign Language (ArSL, paired with Arabic) — with the same three tools in each.</w:t>
       </w:r>
     </w:p>
     <w:p>
@@ -50,12 +50,12 @@
         <w:t xml:space="preserve">Purpose: </w:t>
       </w:r>
       <w:r>
-        <w:t>To describe how the Education tab is composed and how it fits into the existing App Home Page navigation.</w:t>
+        <w:t>To describe how the Education tab is composed and navigated.</w:t>
       </w:r>
     </w:p>
     <w:p>
       <w:r>
-        <w:t>The Education tab is one of the two primary tabs on the App Home Page, alongside Chatting. Selecting it swaps the Chatting panel for a “Learn to Sign” section that is itself split into two side-by-side columns inside a responsive grid layout:</w:t>
+        <w:t>The Education tab (frontend/src/pages/EducationTab.jsx) is one of the primary tabs on the App Home Page. A header sub-navigation offers a language toggle — “ASL · English” / “ArSL · العربية” — and the tab body presents three tools:</w:t>
       </w:r>
     </w:p>
     <w:p>
@@ -66,10 +66,10 @@
         <w:rPr>
           <w:b/>
         </w:rPr>
-        <w:t xml:space="preserve">Left column — Fingerspelling · A–Z: </w:t>
+        <w:t xml:space="preserve">Sign Viewer: </w:t>
       </w:r>
       <w:r>
-        <w:t>renders the ASLStickman component. A user types any word into a text field and the stickman spells it out letter by letter, with the current letter, its distinguishing cue, and a live alphabet reference grid shown alongside the animation.</w:t>
+        <w:t>browse a categorized vocabulary of word signs and watch each one performed by a motion-capture skeleton, or open the Fingerspelling view to spell any typed word letter by letter (Section 13.4).</w:t>
       </w:r>
     </w:p>
     <w:p>
@@ -80,15 +80,29 @@
         <w:rPr>
           <w:b/>
         </w:rPr>
-        <w:t xml:space="preserve">Right column — Word Signs · Full Body: </w:t>
+        <w:t xml:space="preserve">Sentence Builder: </w:t>
       </w:r>
       <w:r>
-        <w:t>renders the ASLWordStickman component. A user picks one of fifteen common everyday words (COME, DRINK, EAT, GO, HELLO, HELP, LEARN, MORE, NAME, NO, PLEASE, SORRY, STOP, WATER, YES) from a button grid and watches a full-body stick figure perform the sign, at a Slow (1.0×) or Normal (0.55× duration) playback speed.</w:t>
+        <w:t>type any free-form sentence and watch the skeleton sign it end-to-end — dictionary words are signed, unknown words are automatically fingerspelled (Section 13.5).</w:t>
+      </w:r>
+    </w:p>
+    <w:p>
+      <w:pPr>
+        <w:pStyle w:val="ListBullet"/>
+      </w:pPr>
+      <w:r>
+        <w:rPr>
+          <w:b/>
+        </w:rPr>
+        <w:t xml:space="preserve">Practice mode: </w:t>
+      </w:r>
+      <w:r>
+        <w:t>perform a prompted letter or word into the webcam and get instant correct/incorrect feedback from the same recognition models that power the live Chatting tab (Section 13.7).</w:t>
       </w:r>
     </w:p>
     <w:p>
       <w:r>
-        <w:t>Both columns share an introductory line of copy above the grid explaining the two practice modes, and each column carries its own short instructional subtitle so the two panels can be understood independently.</w:t>
+        <w:t>Switching languages remounts the three tool components with a React key={lang}, so selection, playback and camera state reset naturally without manual state-synchronization logic. Each component receives its language-specific configuration (word list, categories, alphabet, text direction, placeholder copy) from a single LANG_CONFIG lookup, so the English and Arabic experiences share one code path.</w:t>
       </w:r>
     </w:p>
     <w:p>
@@ -96,7 +110,7 @@
         <w:pStyle w:val="Heading2"/>
       </w:pPr>
       <w:r>
-        <w:t>13.2 Motivation: Replacing a Heavy Third-Party Renderer</w:t>
+        <w:t>13.2 Skeleton Rendering: Motion-Captured Signs</w:t>
       </w:r>
     </w:p>
     <w:p>
@@ -111,12 +125,59 @@
         <w:t xml:space="preserve">Purpose: </w:t>
       </w:r>
       <w:r>
-        <w:t>To record why the education page was rebuilt as a bespoke Canvas2D renderer rather than continuing to rely on an imported animation library.</w:t>
+        <w:t>To record why the education content was rebuilt on real motion-capture data and how it is rendered.</w:t>
       </w:r>
     </w:p>
     <w:p>
       <w:r>
-        <w:t>An earlier iteration of the word-sign panel rendered full-body signs through a third-party &lt;pose-viewer&gt; web component — a Stencil/WebGL-based custom element loading external .pose files, roughly 20 MB of dependency weight. In practice this made the Education tab noticeably laggy and occasionally desynchronised from the correct ASL handshape, since the component's bundled pose data did not always match the sign being requested. Both stickman panels were therefore rewritten from scratch as pure Canvas 2D drawing routines with no external animation runtime: the entire rendering stack — palette, easing curves, interpolation helpers, inverse kinematics, and the hand-drawing routine — is implemented in a single shared utility module (aslRenderer.js) with zero third-party dependencies. This keeps the panel smooth even on modest laptop hardware, and keeps the rendered handshape and the underlying landmark data as one single source of truth.</w:t>
+        <w:t>An earlier iteration animated signs with a hand-authored 2D canvas stickman: every sign was a manually written sequence of wrist keyframes and procedurally constructed handshapes. That approach could not scale in either quantity or quality — each new sign required careful manual authoring and geometric verification, and even a correct keyframe animation reads as a symbolic illustration rather than as a human performing the sign. The section was therefore rebuilt on skeleton recordings of real signers:</w:t>
+      </w:r>
+    </w:p>
+    <w:p>
+      <w:pPr>
+        <w:pStyle w:val="ListBullet"/>
+      </w:pPr>
+      <w:r>
+        <w:rPr>
+          <w:b/>
+        </w:rPr>
+        <w:t xml:space="preserve">Data format: </w:t>
+      </w:r>
+      <w:r>
+        <w:t>.pose files — the standard binary format of the pose-format library — containing per-frame MediaPipe Holistic landmarks (body, face and both hands) extracted from video of a human signer.</w:t>
+      </w:r>
+    </w:p>
+    <w:p>
+      <w:pPr>
+        <w:pStyle w:val="ListBullet"/>
+      </w:pPr>
+      <w:r>
+        <w:rPr>
+          <w:b/>
+        </w:rPr>
+        <w:t xml:space="preserve">Renderer: </w:t>
+      </w:r>
+      <w:r>
+        <w:t>the &lt;pose-viewer&gt; web component from the sign-language-processing project (the same renderer used by the open-source sign.mt translation platform), which plays a .pose file as an animated full-body skeleton with per-finger articulation. The component is driven imperatively from React: playback rate, play/pause, and completion (ended$) and load (loadeddata$) events.</w:t>
+      </w:r>
+    </w:p>
+    <w:p>
+      <w:pPr>
+        <w:pStyle w:val="ListBullet"/>
+      </w:pPr>
+      <w:r>
+        <w:rPr>
+          <w:b/>
+        </w:rPr>
+        <w:t xml:space="preserve">Content source: </w:t>
+      </w:r>
+      <w:r>
+        <w:t>sign.mt's public dictionary API (fetch_signmt_pose.py), which translates a spoken-language word into a signed-language pose clip drawn from a curated dictionary — American Sign Language (ase) for English and Jordanian Sign Language (jos) for Arabic, the only openly available Arabic-lookup sign dictionary. Every clip is attributed on-page (“Motion captured from a real signer”).</w:t>
+      </w:r>
+    </w:p>
+    <w:p>
+      <w:r>
+        <w:t>One rendering subtlety is worth recording: the pose-viewer custom element upgrades lazily, and a false JSX boolean attribute is simply removed from the DOM — so autoplay={false} never reaches the component, whose internal default is true. Each component therefore sets el.autoplay = false imperatively in a mount effect. The legacy canvas stickman remains only as a fallback renderer for the few English words that have hand-authored keyframes but no .pose file.</w:t>
       </w:r>
     </w:p>
     <w:p>
@@ -124,7 +185,7 @@
         <w:pStyle w:val="Heading2"/>
       </w:pPr>
       <w:r>
-        <w:t>13.3 Shared Rendering Engine (aslRenderer.js)</w:t>
+        <w:t>13.3 Server-Side Animation Stitching (pose_concat.py)</w:t>
       </w:r>
     </w:p>
     <w:p>
@@ -139,12 +200,59 @@
         <w:t xml:space="preserve">Purpose: </w:t>
       </w:r>
       <w:r>
-        <w:t>To describe the low-level drawing primitives reused by both the fingerspelling and word-sign panels.</w:t>
+        <w:t>To describe how multiple sign clips are combined into one smooth, natural-looking animation instead of a choppy clip-after-clip playback.</w:t>
       </w:r>
     </w:p>
     <w:p>
       <w:r>
-        <w:t>Both stickman components are built on one shared, framework-free utility module that exposes:</w:t>
+        <w:t>Playing letter or word clips back-to-back on the client produced a visibly laggy experience: between every two clips the skeleton snapped from one pose to another, with a network fetch in between. All multi-sign playback was therefore moved server-side. The model-services FastAPI application stitches the requested signs into ONE .pose file using spoken-to-signed — sign.mt's own concatenation package — and streams the finished animation to the client:</w:t>
+      </w:r>
+    </w:p>
+    <w:p>
+      <w:pPr>
+        <w:ind w:left="720" w:hanging="360"/>
+      </w:pPr>
+      <w:r>
+        <w:rPr>
+          <w:b/>
+        </w:rPr>
+        <w:t xml:space="preserve">1. </w:t>
+      </w:r>
+      <w:r>
+        <w:t>Each clip is reduced (redundant landmarks dropped), normalized, and trimmed at natural boundaries (the wrist-above-elbow heuristic finds where signing actually starts and ends).</w:t>
+      </w:r>
+    </w:p>
+    <w:p>
+      <w:pPr>
+        <w:ind w:left="720" w:hanging="360"/>
+      </w:pPr>
+      <w:r>
+        <w:rPr>
+          <w:b/>
+        </w:rPr>
+        <w:t xml:space="preserve">2. </w:t>
+      </w:r>
+      <w:r>
+        <w:t>Adjacent clips are cut at their best connection point — the frame pair where the two skeletons are geometrically closest — so one sign flows into the next.</w:t>
+      </w:r>
+    </w:p>
+    <w:p>
+      <w:pPr>
+        <w:ind w:left="720" w:hanging="360"/>
+      </w:pPr>
+      <w:r>
+        <w:rPr>
+          <w:b/>
+        </w:rPr>
+        <w:t xml:space="preserve">3. </w:t>
+      </w:r>
+      <w:r>
+        <w:t>A short zero-confidence gap (0.2 s) is inserted at every boundary and filled by interpolation, then the whole sequence is smoothed with a Savitzky–Golay filter, wrist positions are corrected, and the result is size-normalized.</w:t>
+      </w:r>
+    </w:p>
+    <w:p>
+      <w:r>
+        <w:t>Three endpoints expose this pipeline, all language-parameterized:</w:t>
       </w:r>
     </w:p>
     <w:p>
@@ -155,10 +263,10 @@
         <w:rPr>
           <w:b/>
         </w:rPr>
-        <w:t xml:space="preserve">Colour palette (COLORS): </w:t>
+        <w:t xml:space="preserve">/api/pose-seq (mode=words): </w:t>
       </w:r>
       <w:r>
-        <w:t>assigns semantic meaning to each visual element — violet for the static body/torso/left arm, pink for the active signing arm, amber for the thumb (so palm orientation reads instantly), pale yellow for knuckle joints, and white for fingertips. The same convention is used consistently across both panels so a learner does not have to re-learn a colour code between fingerspelling and word-sign practice.</w:t>
+        <w:t>stitches a list of named signs with natural trimmed motion — used when the Sign Viewer plays a single word.</w:t>
       </w:r>
     </w:p>
     <w:p>
@@ -169,10 +277,10 @@
         <w:rPr>
           <w:b/>
         </w:rPr>
-        <w:t xml:space="preserve">Hand landmark layout (HAND_CONNECTIONS): </w:t>
+        <w:t xml:space="preserve">/api/pose-seq (mode=spell): </w:t>
       </w:r>
       <w:r>
-        <w:t>a MediaPipe-compatible 21-point layout — landmark 0 is the wrist; landmarks 1–4, 5–8, 9–12, 13–16 and 17–20 are the thumb, index, middle, ring and pinky chains respectively — matching the same landmark convention used by the live-translation letter models, so hand-pose data is conceptually interchangeable between the recognition pipeline and the teaching visualisation.</w:t>
+        <w:t>fingerspelling mode. Letter clips are inconsistent upstream (some are 3-frame stills, some full 25/30 fps clips), and connection-point cutting can shrink a letter to a few unreadable frames — so spell mode instead slices each letter to its central held handshape and freezes it for 0.35 s, producing a uniform, readable spelling rhythm.</w:t>
       </w:r>
     </w:p>
     <w:p>
@@ -183,52 +291,15 @@
         <w:rPr>
           <w:b/>
         </w:rPr>
-        <w:t xml:space="preserve">Easing table (EASE): </w:t>
+        <w:t xml:space="preserve">/api/pose-text: </w:t>
       </w:r>
       <w:r>
-        <w:t>linear, easeIn, easeOut, easeInOut and easeOutBack cubic/back-easing curves used to time keyframe transitions in the word-sign animation.</w:t>
+        <w:t>free-text mode for the Sentence Builder (Section 13.5).</w:t>
       </w:r>
     </w:p>
     <w:p>
-      <w:pPr>
-        <w:pStyle w:val="ListBullet"/>
-      </w:pPr>
       <w:r>
-        <w:rPr>
-          <w:b/>
-        </w:rPr>
-        <w:t xml:space="preserve">Interpolation helpers: </w:t>
-      </w:r>
-      <w:r>
-        <w:t>lerp, lerpXY, and lerpPose — the last of which linearly blends every one of the 21 landmarks between two full hand poses simultaneously, producing the smooth “morphing” effect seen when the fingerspelling stickman transitions between two letters.</w:t>
-      </w:r>
-    </w:p>
-    <w:p>
-      <w:pPr>
-        <w:pStyle w:val="ListBullet"/>
-      </w:pPr>
-      <w:r>
-        <w:rPr>
-          <w:b/>
-        </w:rPr>
-        <w:t xml:space="preserve">Two-joint inverse-kinematics solver (solveArm): </w:t>
-      </w:r>
-      <w:r>
-        <w:t>used only by the word-sign panel; see Section 13.6.</w:t>
-      </w:r>
-    </w:p>
-    <w:p>
-      <w:pPr>
-        <w:pStyle w:val="ListBullet"/>
-      </w:pPr>
-      <w:r>
-        <w:rPr>
-          <w:b/>
-        </w:rPr>
-        <w:t xml:space="preserve">Batched hand-drawing routine (drawHand): </w:t>
-      </w:r>
-      <w:r>
-        <w:t>anchors landmark 0 at a given canvas point and scales the remaining 20 landmarks around it, so the same 21-point pose data can be rendered at a fixed wrist (fingerspelling) or at a wrist that itself moves under inverse kinematics (word signs). Drawing is batched per visual layer — one filled path for the palm outline, one stroke pass for all non-thumb finger bones, one stroke pass for the thumb, one fill pass for every knuckle, one fill pass for every fingertip — rather than issuing a separate canvas call per bone or joint, keeping each animation frame cheap to render.</w:t>
+        <w:t>Every stitching endpoint has a /meta twin returning per-segment durations on the final timeline, which the frontend uses to highlight the currently playing word chip or letter with plain timers — the animation itself is a single opaque file, so synchronized UI feedback must come from metadata. Results are memoized server-side (functools.lru_cache), and Content-Disposition headers use RFC 5987 encoding because Arabic filenames cannot be represented in latin-1 HTTP headers.</w:t>
       </w:r>
     </w:p>
     <w:p>
@@ -236,7 +307,7 @@
         <w:pStyle w:val="Heading2"/>
       </w:pPr>
       <w:r>
-        <w:t>13.4 Fingerspelling Panel (ASLStickman)</w:t>
+        <w:t>13.4 Sign Viewer</w:t>
       </w:r>
     </w:p>
     <w:p>
@@ -251,57 +322,45 @@
         <w:t xml:space="preserve">Purpose: </w:t>
       </w:r>
       <w:r>
-        <w:t>To describe how arbitrary typed text is converted into a sequence of animated ASL letter handshapes.</w:t>
+        <w:t>To describe the vocabulary browser and fingerspelling tool (ASLWordStickman.jsx).</w:t>
       </w:r>
     </w:p>
     <w:p>
       <w:r>
-        <w:t>The left-hand panel lets a user type any word (up to 40 characters) and press Play. The component:</w:t>
+        <w:t>The Sign Viewer presents the language's vocabulary as category tabs (e.g. Everyday Words, People, Feelings; كلمات يومية، الناس، مشاعر وصفات …) with one button per word. Selecting a word previews its first frame; Play streams the sign at a chosen speed (Slow 0.5× or Normal 1×, the default). Each word is captioned with its meaning — for Arabic, an English gloss, since the app's UI language is English. A final tab, Fingerspelling, replaces the word grid with:</w:t>
       </w:r>
     </w:p>
     <w:p>
       <w:pPr>
-        <w:pStyle w:val="ListNumber"/>
+        <w:pStyle w:val="ListBullet"/>
       </w:pPr>
       <w:r>
-        <w:t>Filters the typed text down to the characters it can render — the 26 letters plus a space glyph representing a neutral/rest handshape — via the shared ASL_POSES lookup table.</w:t>
+        <w:rPr>
+          <w:b/>
+        </w:rPr>
+        <w:t xml:space="preserve">A letter reference grid </w:t>
+      </w:r>
+      <w:r>
+        <w:t>(A–Z for ASL; the 28 Arabic base letters for ArSL): tapping a letter plays its held handshape clip.</w:t>
       </w:r>
     </w:p>
     <w:p>
       <w:pPr>
-        <w:pStyle w:val="ListNumber"/>
+        <w:pStyle w:val="ListBullet"/>
       </w:pPr>
       <w:r>
-        <w:t>Draws a static stick figure (head, torso, legs, a relaxed left arm) with the right arm permanently raised toward a fixed wrist position, so only the hand itself needs to animate.</w:t>
+        <w:rPr>
+          <w:b/>
+        </w:rPr>
+        <w:t xml:space="preserve">A free spelling input: </w:t>
       </w:r>
-    </w:p>
-    <w:p>
-      <w:pPr>
-        <w:pStyle w:val="ListNumber"/>
-      </w:pPr>
       <w:r>
-        <w:t>Steps through the filtered letter sequence one at a time. Each letter has two animation phases: a 260 ms morph, during which lerpPose blends all 21 landmarks from the previous letter's handshape into the new one using an ease-in-out curve, followed by a 620 ms hold during which the completed handshape is held still so it can be read.</w:t>
-      </w:r>
-    </w:p>
-    <w:p>
-      <w:pPr>
-        <w:pStyle w:val="ListNumber"/>
-      </w:pPr>
-      <w:r>
-        <w:t>Overlays the current letter in large text above the head, and renders a caption drawn from ASL_HINTS — a short, single distinguishing cue per letter — plus a row of progress dots indicating how far through the typed word the animation has advanced.</w:t>
-      </w:r>
-    </w:p>
-    <w:p>
-      <w:pPr>
-        <w:pStyle w:val="ListNumber"/>
-      </w:pPr>
-      <w:r>
-        <w:t>Special-cases the two ASL letters that are not static poses — J and Z — via a MOTION_LETTERS list. For these two letters the underlying handshape is held fixed (J reuses the I handshape; Z uses a pointing index finger) while a small time-based wrist offset traces the letter's characteristic motion in the air: J traces a downward hook-and-curl, and Z traces the three strokes of the letter itself, evaluated as a piecewise function of the hold phase's progress.</w:t>
+        <w:t>any typed word is filtered to spellable letters and played as one server-stitched spell-mode sequence, with the on-screen letter grid highlighting each letter in sync via the /meta timing data.</w:t>
       </w:r>
     </w:p>
     <w:p>
       <w:r>
-        <w:t>Below the animation canvas the panel also renders a 26-button A–Z reference grid; tapping any letter (when not currently playing a word) freezes the stickman on that single handshape and its hint text, letting a learner browse the whole alphabet independently of typing a word.</w:t>
+        <w:t>The English vocabulary counts 44 words (38 with motion-capture poses, plus grammar words for sentence building) and 26 letters; the Arabic vocabulary counts 22 browsable word signs across five categories plus 28 letters. If the configured default word is ever pruned from the vocabulary, the component falls back to the first available word rather than rendering an empty viewer.</w:t>
       </w:r>
     </w:p>
     <w:p>
@@ -309,7 +368,7 @@
         <w:pStyle w:val="Heading2"/>
       </w:pPr>
       <w:r>
-        <w:t>13.5 Full-Body Word-Sign Panel (ASLWordStickman)</w:t>
+        <w:t>13.5 Sentence Builder — Free-Text Signing</w:t>
       </w:r>
     </w:p>
     <w:p>
@@ -324,57 +383,87 @@
         <w:t xml:space="preserve">Purpose: </w:t>
       </w:r>
       <w:r>
-        <w:t>To describe how a single ASL word gloss is expressed as a keyframed, full-body animation.</w:t>
+        <w:t>To describe how an arbitrary typed sentence becomes one continuous signed animation (SentenceBuilder.jsx).</w:t>
       </w:r>
     </w:p>
     <w:p>
       <w:r>
-        <w:t>The right-hand panel is driven by a small per-word animation library (aslWordPoses.js) rather than a single static handshape. Each of the fifteen supported words maps to a WORD_ANIMS entry consisting of a short human-readable description and an ordered array of keyframes. Every keyframe specifies, for either or both hands, a target wrist position on the 320×500 canvas, a target handshape (drawn from the same ASL_POSES letter/handshape table used by the fingerspelling panel, since ASL word signs are frequently built from the same underlying handshapes as the manual alphabet), optional vertical offsets for the head and shoulders (used for signs that involve a lean or a shrug), a move duration, a hold duration, and a named easing curve.</w:t>
+        <w:t>The Sentence Builder follows sign.mt's interaction model: the user types any sentence; words found in the sign dictionary are signed, and unknown words are fingerspelled letter by letter. The server's plan builder (pose_concat.build_text_sequence) implements this as follows:</w:t>
+      </w:r>
+    </w:p>
+    <w:p>
+      <w:pPr>
+        <w:ind w:left="720" w:hanging="360"/>
+      </w:pPr>
+      <w:r>
+        <w:rPr>
+          <w:b/>
+        </w:rPr>
+        <w:t xml:space="preserve">1. </w:t>
+      </w:r>
+      <w:r>
+        <w:t>The text is tokenized (lowercased; Arabic diacritics stripped; digits 1–5 and Arabic-Indic ١–٥ mapped to their number words).</w:t>
+      </w:r>
+    </w:p>
+    <w:p>
+      <w:pPr>
+        <w:ind w:left="720" w:hanging="360"/>
+      </w:pPr>
+      <w:r>
+        <w:rPr>
+          <w:b/>
+        </w:rPr>
+        <w:t xml:space="preserve">2. </w:t>
+      </w:r>
+      <w:r>
+        <w:t>Tokens are matched greedily against the dictionary, longest phrase first (3-gram, then 2-gram, then single word) — multi-word entries such as “thank you” or “مع السلامة” exist as ONE pose file and must not be split into unknown singles and spelled.</w:t>
+      </w:r>
+    </w:p>
+    <w:p>
+      <w:pPr>
+        <w:ind w:left="720" w:hanging="360"/>
+      </w:pPr>
+      <w:r>
+        <w:rPr>
+          <w:b/>
+        </w:rPr>
+        <w:t xml:space="preserve">3. </w:t>
+      </w:r>
+      <w:r>
+        <w:t>Lookups are orthography-tolerant (Section 13.6): both the query and the stored filenames are folded before comparison.</w:t>
+      </w:r>
+    </w:p>
+    <w:p>
+      <w:pPr>
+        <w:ind w:left="720" w:hanging="360"/>
+      </w:pPr>
+      <w:r>
+        <w:rPr>
+          <w:b/>
+        </w:rPr>
+        <w:t xml:space="preserve">4. </w:t>
+      </w:r>
+      <w:r>
+        <w:t>Any token still unmatched is decomposed into its letters and fingerspelled inline, using the same held-peak spelling treatment as the Fingerspelling tab.</w:t>
+      </w:r>
+    </w:p>
+    <w:p>
+      <w:pPr>
+        <w:ind w:left="720" w:hanging="360"/>
+      </w:pPr>
+      <w:r>
+        <w:rPr>
+          <w:b/>
+        </w:rPr>
+        <w:t xml:space="preserve">5. </w:t>
+      </w:r>
+      <w:r>
+        <w:t>The full plan is stitched into one smooth animation and returned with per-token and per-letter timing metadata.</w:t>
       </w:r>
     </w:p>
     <w:p>
       <w:r>
-        <w:t>At playback time the component:</w:t>
-      </w:r>
-    </w:p>
-    <w:p>
-      <w:pPr>
-        <w:pStyle w:val="ListBullet"/>
-      </w:pPr>
-      <w:r>
-        <w:t>Walks the keyframe array with requestAnimationFrame, tracking, for each keyframe, how much of its declared move duration and hold duration (both scaled by the selected Slow/Normal speed multiplier) has elapsed.</w:t>
-      </w:r>
-    </w:p>
-    <w:p>
-      <w:pPr>
-        <w:pStyle w:val="ListBullet"/>
-      </w:pPr>
-      <w:r>
-        <w:t>During the move phase, linearly interpolates each wrist from the previous keyframe's resting position toward the current keyframe's target using that keyframe's own easing curve, and separately snaps the rendered handshape over to the new target at the 50%-progress mark of the move — rather than at its start or end — so a handshape change reads as occurring mid-transition rather than as an abrupt pop at either boundary.</w:t>
-      </w:r>
-    </w:p>
-    <w:p>
-      <w:pPr>
-        <w:pStyle w:val="ListBullet"/>
-      </w:pPr>
-      <w:r>
-        <w:t>During the hold phase, freezes on the keyframe's exact target position and handshape so the pose can be read.</w:t>
-      </w:r>
-    </w:p>
-    <w:p>
-      <w:pPr>
-        <w:pStyle w:val="ListBullet"/>
-      </w:pPr>
-      <w:r>
-        <w:t>Returns both wrists to a shared neutral rest position at the sides of the body at the end of every completed word, and shows a translucent “▶ Press Play to sign” / “↻ Press Play again” caption on the idle canvas.</w:t>
-      </w:r>
-    </w:p>
-    <w:p>
-      <w:pPr>
-        <w:pStyle w:val="ListBullet"/>
-      </w:pPr>
-      <w:r>
-        <w:t>Renders a row of progress dots along the bottom edge of the canvas, one per keyframe, highlighting the currently active keyframe in the accent colour while it is in its hold phase.</w:t>
+        <w:t>The frontend mirrors the same greedy matching client-side to render a live chip preview as the user types: solid chips are words that will be signed from the dictionary; dashed chips marked 🔤 will be fingerspelled. This honesty matters — a learner must never mistake a spelled word for the word's actual sign. During playback the chips and, for spelled tokens, the individual letters light up in sync with the animation. Input is bounded (12 tokens, 80 stitched segments) so a pathological sentence cannot exhaust the stitching service.</w:t>
       </w:r>
     </w:p>
     <w:p>
@@ -382,7 +471,7 @@
         <w:pStyle w:val="Heading2"/>
       </w:pPr>
       <w:r>
-        <w:t>13.6 Two-Joint Inverse Kinematics and Elbow Continuity</w:t>
+        <w:t>13.6 Arabic Support (ArSL)</w:t>
       </w:r>
     </w:p>
     <w:p>
@@ -397,41 +486,45 @@
         <w:t xml:space="preserve">Purpose: </w:t>
       </w:r>
       <w:r>
-        <w:t>To explain how a single wrist target is converted into a visually natural elbow bend for both arms.</w:t>
+        <w:t>To document the Arabic-specific architecture: content, orthography handling, and known linguistic caveats.</w:t>
       </w:r>
     </w:p>
     <w:p>
       <w:r>
-        <w:t>Because each keyframe only specifies a wrist target — not an elbow position — the stickman's upper-arm and forearm segments (each a fixed-length bone from a shoulder anchored at a fixed point) are resolved every frame by a two-bone (shoulder → elbow → wrist) inverse-kinematics solver, solveArm. Given a shoulder point, a wrist target, the two bone lengths, and a “hint” point, the solver:</w:t>
+        <w:t>Every pose endpoint takes lang=en|ar and resolves content from a per-language directory (poses/ vs poses/ar/). The frontend components are fully parameterized: right-to-left text direction on Arabic inputs and labels, Arabic-Indic digit handling, and Arabic category labels. Two Arabic-specific engineering problems are worth recording:</w:t>
       </w:r>
     </w:p>
     <w:p>
       <w:pPr>
-        <w:pStyle w:val="ListNumber"/>
+        <w:pStyle w:val="ListBullet"/>
       </w:pPr>
       <w:r>
-        <w:t>Clamps the shoulder-to-wrist distance so it never exceeds the sum of the two bone lengths or drops below their difference, which keeps the triangle solvable even for a keyframe whose author placed the wrist slightly out of the arm's true reach.</w:t>
+        <w:rPr>
+          <w:b/>
+        </w:rPr>
+        <w:t xml:space="preserve">Orthographic variance. </w:t>
+      </w:r>
+      <w:r>
+        <w:t>Arabic words are commonly typed without hamza/madda marks (ام for أم, اسف for آسف), yet the sign dictionary keys many entries under proper orthography — and vice versa. A single folding table (أ إ آ ٱ → ا, ى ئ → ي, ؤ → و, ة → ه, ء dropped) is applied to BOTH sides of every lookup: the server resolves queries through a folded-name index (pose_concat.resolve_pose_name), and the client mirrors the same fold for chip previews (poseViewer.foldWord) and practice-answer matching. Files keep their proper spellings; users may type either form.</w:t>
       </w:r>
     </w:p>
     <w:p>
       <w:pPr>
-        <w:pStyle w:val="ListNumber"/>
+        <w:pStyle w:val="ListBullet"/>
       </w:pPr>
       <w:r>
-        <w:t>Uses the law of cosines to find the elbow angle relative to the shoulder–wrist axis, which — because the law of cosines only determines an angle's magnitude — always yields two mathematically valid elbow positions, one on either side of the shoulder–wrist line.</w:t>
+        <w:rPr>
+          <w:b/>
+        </w:rPr>
+        <w:t xml:space="preserve">Fingerspelling alphabet. </w:t>
       </w:r>
-    </w:p>
-    <w:p>
-      <w:pPr>
-        <w:pStyle w:val="ListNumber"/>
-      </w:pPr>
       <w:r>
-        <w:t>Picks whichever of the two candidate elbow positions is closer to the supplied hint point.</w:t>
+        <w:t>ArSL fingerspelling uses the 28 base letters; variant forms fold onto the letters that have clips (e.g. ة spells as ه), and diacritics are stripped before spelling.</w:t>
       </w:r>
     </w:p>
     <w:p>
       <w:r>
-        <w:t>A naive implementation would supply a single fixed hint per arm (the module does define static defaults that keep the elbows bending forward and outward in a natural resting direction), but doing so for every frame of a fast animation can make the elbow visibly “teleport” between the two IK solutions whenever the wrist crosses the line along which both solutions are equally close to the fixed hint. The word-sign player instead feeds each frame's own resolved elbow position forward as the next frame's hint — only the very first frame of a playback falls back to the static default — so the elbow always continues bending in whichever direction it was already bending, eliminating discontinuous flips mid-sign.</w:t>
+        <w:t>Two linguistic caveats are documented for the team. First, the Arabic sign content is Jordanian Sign Language (jos) — the only openly available Arabic sign dictionary — while the ArSL recognition models were trained on KArSL (Saudi) data; regional sign variants differ, so the viewer and the recognizer are not guaranteed to agree on every word. Second, sentence signing follows the typed word order (a transliteration); it does not reorder into natural sign-language grammar. Both are acceptable for a learning aid but should be stated honestly in any evaluation.</w:t>
       </w:r>
     </w:p>
     <w:p>
@@ -439,7 +532,7 @@
         <w:pStyle w:val="Heading2"/>
       </w:pPr>
       <w:r>
-        <w:t>13.7 Hand Pose Library (aslHandPoses.js)</w:t>
+        <w:t>13.7 Practice Mode — Learn by Doing</w:t>
       </w:r>
     </w:p>
     <w:p>
@@ -454,12 +547,12 @@
         <w:t xml:space="preserve">Purpose: </w:t>
       </w:r>
       <w:r>
-        <w:t>To document how the 21-landmark handshape for every fingerspelling letter is constructed and verified.</w:t>
+        <w:t>To describe the webcam practice loop and how it reuses the existing recognition pipeline (PracticePanel.jsx).</w:t>
       </w:r>
     </w:p>
     <w:p>
       <w:r>
-        <w:t>Rather than hand-authoring 21 raw coordinate pairs per letter, each handshape in ASL_POSES is built procedurally from a small set of anatomical building blocks:</w:t>
+        <w:t>Practice mode closes the learning loop: after watching a sign, the user performs it. The panel reuses the exact camera-and-predict pipeline that powers the live Chatting tab — extracted into a shared useCamera hook — with its own camera instance so the two tabs never interfere:</w:t>
       </w:r>
     </w:p>
     <w:p>
@@ -467,7 +560,13 @@
         <w:pStyle w:val="ListBullet"/>
       </w:pPr>
       <w:r>
-        <w:t>Four fixed palm-anchor points (the wrist, the thumb's base joint, and the index/middle/ring/pinky knuckle positions).</w:t>
+        <w:rPr>
+          <w:b/>
+        </w:rPr>
+        <w:t xml:space="preserve">Letter practice: </w:t>
+      </w:r>
+      <w:r>
+        <w:t>the panel prompts a random letter; the user poses it and a single webcam frame is sent to POST /predict (mode=letters). The models return exactly the comparison target — an uppercase English letter or a real Arabic glyph — so matching is a normalized string comparison (isLetterMatch).</w:t>
       </w:r>
     </w:p>
     <w:p>
@@ -475,7 +574,13 @@
         <w:pStyle w:val="ListBullet"/>
       </w:pPr>
       <w:r>
-        <w:t>Per-finger segment lengths for the three bones of each of the four non-thumb fingers.</w:t>
+        <w:rPr>
+          <w:b/>
+        </w:rPr>
+        <w:t xml:space="preserve">Word practice: </w:t>
+      </w:r>
+      <w:r>
+        <w:t>the panel prompts a word, runs a 3-2-1 countdown (cued performance needs reaction time), records a 3.2-second clip, and sends it to POST /predict (mode=words). Arabic matching folds orthography on both sides so the model's bare-spelled labels (انا) match the vocabulary's proper spellings (أنا).</w:t>
       </w:r>
     </w:p>
     <w:p>
@@ -483,7 +588,13 @@
         <w:pStyle w:val="ListBullet"/>
       </w:pPr>
       <w:r>
-        <w:t>A seg4() helper that walks outward from a knuckle along a base direction (in degrees) and applies a cumulative joint-flex offset at each of the three joints, returning the finger's [MCP, PIP, DIP, TIP] points.</w:t>
+        <w:rPr>
+          <w:b/>
+        </w:rPr>
+        <w:t xml:space="preserve">Honest target lists: </w:t>
+      </w:r>
+      <w:r>
+        <w:t>only words the deployed checkpoints can actually recognize are offered for checking — the 12 education words inside the WLASL-100 class list for ASL, and the 6-word fold-normalized intersection with the KArSL model's 32 labels for ArSL (لا، اسم، مع السلامة، أنا، آسف، دقيقة). Everything else is watch-only rather than silently impossible.</w:t>
       </w:r>
     </w:p>
     <w:p>
@@ -491,25 +602,18 @@
         <w:pStyle w:val="ListBullet"/>
       </w:pPr>
       <w:r>
-        <w:t>A small named library of reusable curl patterns — straight, a gentle curve, a half-curl that meets the thumb, a tight fist, a hook bent mainly at the middle joint, and a finger draped over the thumb — so that visually related letters reuse the same curl constants rather than each defining bespoke joint angles.</w:t>
+        <w:rPr>
+          <w:b/>
+        </w:rPr>
+        <w:t xml:space="preserve">Constructive feedback: </w:t>
       </w:r>
-    </w:p>
-    <w:p>
-      <w:pPr>
-        <w:pStyle w:val="ListBullet"/>
-      </w:pPr>
       <w:r>
-        <w:t>A dedicated thumb() helper, since the thumb has only three bone segments and moves largely independently of the curl patterns above.</w:t>
+        <w:t>when the model saw a sign but stayed below its confidence threshold, the UI reports its best guess (“it looked like X, just not clearly enough”) instead of a generic failure, distinguishing “almost had it” from “wrong sign entirely”.</w:t>
       </w:r>
     </w:p>
     <w:p>
       <w:r>
-        <w:t>The resulting pose() call concatenates the wrist with all five fingers into the same 21-point MediaPipe ordering used everywhere else in the system. Each handshape additionally carries a one-line entry in ASL_HINTS — a single, specific visual cue (for example, which finger is extended, or how the thumb is positioned relative to the fist) — that is surfaced as an on-canvas caption during both the alphabet reference grid and the fingerspelling animation, so a learner is told what to look for rather than only being shown a picture.</w:t>
-      </w:r>
-    </w:p>
-    <w:p>
-      <w:r>
-        <w:t>Handshape and word-sign correctness were treated as a first-class engineering concern rather than a one-off design pass. Early iterations of the word-sign library were built primarily from general recollection of ASL and were found, on review, to contain a number of signs that did not match authoritative usage — an incorrect handshape, an incorrect number of hands, or a location or motion that did not match the real sign. The animation data was subsequently revised through a structured verification pass: each word's motion, handshape(s) and hand count were checked against established ASL reference material, and any sign flagged as incorrect was corrected in aslWordPoses.js and re-verified by rendering and visually inspecting the animation frame-by-frame, since some defects — such as two hands rendering close enough together to visually merge into an indistinguishable blob, or a keyframe wrist coordinate placed just outside the head's drawn radius so a sign meant to touch the forehead instead appeared to float beside it — are geometry bugs that only surface once the sign is actually rendered, not when its written description is reviewed in isolation.</w:t>
+        <w:t>Serving the legacy recognition models required its own engineering: the checkpoints were trained on Keras 2.10, which cannot run on the service's Python 3.12. A compatibility loader (legacy_h5.py) rewrites each .h5 file's serialized config — removing arguments Keras 3 no longer accepts — and loads the result through Keras 3 on a PyTorch backend, preserving the trained weights unchanged.</w:t>
       </w:r>
     </w:p>
     <w:p>
@@ -517,7 +621,7 @@
         <w:pStyle w:val="Heading2"/>
       </w:pPr>
       <w:r>
-        <w:t>13.8 Performance Engineering</w:t>
+        <w:t>13.8 Content Verification — Defeating the Silent Fallback</w:t>
       </w:r>
     </w:p>
     <w:p>
@@ -532,45 +636,59 @@
         <w:t xml:space="preserve">Purpose: </w:t>
       </w:r>
       <w:r>
-        <w:t>To record the specific rendering decisions that keep the Education tab responsive.</w:t>
+        <w:t>To document the methodology that guarantees every vocabulary entry is a genuine sign, which proved to be the hardest data-quality problem in the section.</w:t>
       </w:r>
     </w:p>
     <w:p>
       <w:r>
-        <w:t>Two deliberate choices distinguish this feature's performance profile from a typical continuously animated canvas widget:</w:t>
+        <w:t>The sign.mt dictionary API has a critical property: for a word its dictionary does not contain, it silently returns a FINGERSPELLED letter sequence with HTTP 200 — indistinguishable, at the protocol level, from a real sign. Publishing such a clip as a word sign would teach learners something actively wrong. Visual review alone proved unreliable (a reviewer who does not know Jordanian Sign Language cannot always tell an unfamiliar sign from a spelled sequence), so an automated classifier was built:</w:t>
       </w:r>
     </w:p>
     <w:p>
       <w:pPr>
-        <w:pStyle w:val="ListBullet"/>
+        <w:ind w:left="720" w:hanging="360"/>
       </w:pPr>
       <w:r>
         <w:rPr>
           <w:b/>
         </w:rPr>
-        <w:t xml:space="preserve">No perpetual animation loop. </w:t>
+        <w:t xml:space="preserve">1. </w:t>
       </w:r>
       <w:r>
-        <w:t>Both stickman components request an animation frame only while a sign is actively being played. When idle — including immediately after a sign finishes, and whenever the selected word or preview letter changes — each component instead paints a single static frame and stops, rather than running requestAnimationFrame indefinitely in the background. This means the Education tab consumes essentially no CPU while a user is reading a completed sign or choosing what to play next, and the animation loop is always explicitly cancelled both on Stop and on component unmount to avoid leaking a frame callback.</w:t>
+        <w:t>For a candidate word, fetch the word itself AND the doubled word (the word concatenated with itself) — the doubled form is guaranteed to be out-of-vocabulary, so its returned animation is by construction the cloud's own spelling of the word, processed by the identical pipeline.</w:t>
       </w:r>
     </w:p>
     <w:p>
       <w:pPr>
-        <w:pStyle w:val="ListBullet"/>
+        <w:ind w:left="720" w:hanging="360"/>
       </w:pPr>
       <w:r>
         <w:rPr>
           <w:b/>
         </w:rPr>
-        <w:t xml:space="preserve">A single cached 2D rendering context. </w:t>
+        <w:t xml:space="preserve">2. </w:t>
       </w:r>
       <w:r>
-        <w:t>The canvas's getContext("2d") result is captured once, in a ref, on mount rather than being re-queried on every frame.</w:t>
+        <w:t>Reduce both animations to per-frame handshape descriptors: the 21 right-hand landmarks, wrist-relative and scale-normalized, so global position and size differences cancel.</w:t>
+      </w:r>
+    </w:p>
+    <w:p>
+      <w:pPr>
+        <w:ind w:left="720" w:hanging="360"/>
+      </w:pPr>
+      <w:r>
+        <w:rPr>
+          <w:b/>
+        </w:rPr>
+        <w:t xml:space="preserve">3. </w:t>
+      </w:r>
+      <w:r>
+        <w:t>Compare with start-anchored dynamic time warping (DTW), which absorbs the timing differences the stitching pipeline introduces. If the word's animation matches the spelling's prefix, it IS the spelling fallback; scores separate cleanly (spelled &lt; 0.9, real ≥ 2.9).</w:t>
       </w:r>
     </w:p>
     <w:p>
       <w:r>
-        <w:t>Combined with the removal of the third-party pose-viewer dependency described in Section 13.2, in favour of a small set of dependency-free Canvas2D components and shared data/utility modules, this rewrite was the direct fix for the education page's original lag: the panel now performs comparably to any other lightweight canvas UI element regardless of how long a user leaves it open.</w:t>
+        <w:t>Every accepted clip was additionally reviewed frame-by-frame as a rendered filmstrip. The sweep of ~170 candidate Arabic words produced two further discoveries: the dictionary keys many entries under proper orthography only (أم is a real sign while ام comes back spelled — the direct motivation for the fold-everywhere lookup of Section 13.6), and words containing ة crash the API with HTTP 500 when out-of-vocabulary (its spelling lexicon lacks that letter), which turns the status code into a truth oracle for that word class. The final Arabic vocabulary — 25 verified signs — is exactly the set that passed all checks; everything else fingerspells honestly with the dashed 🔤 treatment.</w:t>
       </w:r>
     </w:p>
     <w:p>
@@ -578,7 +696,7 @@
         <w:pStyle w:val="Heading2"/>
       </w:pPr>
       <w:r>
-        <w:t>13.9 UX and Accessibility Considerations</w:t>
+        <w:t>13.9 Performance and Verification Engineering</w:t>
       </w:r>
     </w:p>
     <w:p>
@@ -593,7 +711,7 @@
         <w:t xml:space="preserve">Purpose: </w:t>
       </w:r>
       <w:r>
-        <w:t>To summarise the interaction-design choices that make the two panels usable as a self-serve learning tool.</w:t>
+        <w:t>To record the decisions that keep the section responsive and the regression-testing approach.</w:t>
       </w:r>
     </w:p>
     <w:p>
@@ -604,10 +722,24 @@
         <w:rPr>
           <w:b/>
         </w:rPr>
-        <w:t xml:space="preserve">Consistent, theme-aware colour language. </w:t>
+        <w:t xml:space="preserve">One stitched file per playback. </w:t>
       </w:r>
       <w:r>
-        <w:t>Both panels draw from the same CSS custom-property palette used throughout the rest of the application, so the Education tab automatically follows the app-wide dark/light theme toggle rather than maintaining its own hard-coded styling.</w:t>
+        <w:t>All multi-sign animation is assembled server-side and cached (lru_cache), so the client performs exactly one media fetch per Play press regardless of sentence length — the fix for the original choppy, per-clip playback.</w:t>
+      </w:r>
+    </w:p>
+    <w:p>
+      <w:pPr>
+        <w:pStyle w:val="ListBullet"/>
+      </w:pPr>
+      <w:r>
+        <w:rPr>
+          <w:b/>
+        </w:rPr>
+        <w:t xml:space="preserve">A single persistent viewer element. </w:t>
+      </w:r>
+      <w:r>
+        <w:t>Each tool keeps one &lt;pose-viewer&gt; mounted across word and tab switches (hidden when a fallback renderer is active), so switching words never re-initializes the rendering component; idle previews load the first frame only.</w:t>
       </w:r>
     </w:p>
     <w:p>
@@ -621,7 +753,7 @@
         <w:t xml:space="preserve">Guarded interaction states. </w:t>
       </w:r>
       <w:r>
-        <w:t>Word and letter selection buttons, and the alphabet reference grid, are disabled while an animation is actively playing, preventing a user from queuing a second sign mid-playback and leaving the component's internal animation state inconsistent with what is on screen.</w:t>
+        <w:t>Word buttons, letter grids and inputs are disabled during playback; playback promises resolve on the component's ended$ event, a cancellation poll, or a hard timeout, so the UI can never wedge in a playing state.</w:t>
       </w:r>
     </w:p>
     <w:p>
@@ -632,24 +764,10 @@
         <w:rPr>
           <w:b/>
         </w:rPr>
-        <w:t xml:space="preserve">Always-visible progress and captioning. </w:t>
+        <w:t xml:space="preserve">End-to-end browser verification. </w:t>
       </w:r>
       <w:r>
-        <w:t>Both panels continuously surface where the viewer is within the current sign — a highlighted progress dot for the active letter or keyframe — alongside a short plain-language caption (the letter's distinguishing cue, or the word's overall description), so the visualisation functions as a teaching aid rather than only an animation.</w:t>
-      </w:r>
-    </w:p>
-    <w:p>
-      <w:pPr>
-        <w:pStyle w:val="ListBullet"/>
-      </w:pPr>
-      <w:r>
-        <w:rPr>
-          <w:b/>
-        </w:rPr>
-        <w:t xml:space="preserve">Responsive canvas sizing. </w:t>
-      </w:r>
-      <w:r>
-        <w:t>Both canvases are declared at a fixed drawing resolution (340×430 for fingerspelling, 320×500 for word signs) but are constrained to a maximum width of 100% in the surrounding layout, so the panel scales down cleanly on narrower viewports without needing separate mobile-specific rendering logic.</w:t>
+        <w:t>Every change to the section was verified in a scripted headless Chrome session (Playwright): log in as a QA user, drive the real UI — switch language, play specific words, type sentences, assert chip classifications — and require zero browser console errors. Sign-content changes were additionally verified by rendering filmstrip sheets of the actual pose data and reviewing them visually.</w:t>
       </w:r>
     </w:p>
     <w:p>
@@ -662,7 +780,7 @@
     </w:p>
     <w:p>
       <w:r>
-        <w:t>The Education tab's two stickman panels — fingerspelling (ASLStickman) and full-body word signing (ASLWordStickman) — are built entirely on a shared, dependency-free Canvas2D rendering module (aslRenderer.js) and two data libraries of procedurally constructed ASL handshapes (aslHandPoses.js) and keyframed word-sign animations (aslWordPoses.js). A two-joint inverse-kinematics solver with frame-to-frame elbow continuity gives the word-sign panel natural-looking arm motion from nothing more than a sequence of wrist targets, while shared interpolation and easing helpers drive smooth handshape morphing in both panels. The rewrite that replaced an earlier, heavier third-party pose-viewer dependency — combined with rendering only while actively animating, rather than in a perpetual loop — is what makes the Education tab responsive, and a structured, render-and-inspect verification pass over the word-sign keyframe data is what keeps the signs it teaches accurate.</w:t>
+        <w:t>The Education section pairs three tools — a categorized Sign Viewer with integrated fingerspelling, a free-text Sentence Builder, and a webcam Practice mode — across two sign languages behind one bilingual architecture. Signs are motion-capture skeletons of real signers (ASL from sign.mt's ase dictionary; Jordanian Sign Language for Arabic), rendered by the pose-viewer web component and stitched server-side into single smooth animations with timing metadata driving synchronized UI highlights. Arabic support required orthography-folded lookup on both client and server, right-to-left interface treatment, and a rigorous DTW-based verification methodology to reject the dictionary API's silent fingerspelling fallbacks — ensuring that every word the page presents as a sign is genuinely that sign, and that everything else is honestly labelled as fingerspelling. Practice mode closes the loop by checking the learner's own signing against the same recognition models that power live translation, offering only targets those models can actually recognize.</w:t>
       </w:r>
     </w:p>
     <w:sectPr>

</xml_diff>